<commit_message>
Reorganised folder structure. Yet again
</commit_message>
<xml_diff>
--- a/Meds/outputs/reports/Cases_Management_Report_Completed_tables_filled_final.docx
+++ b/Meds/outputs/reports/Cases_Management_Report_Completed_tables_filled_final.docx
@@ -69,7 +69,7 @@
         </w:rPr>
       </w:r>
       <w:r>
-        <w:t>Source: Source files: Meds_Cases_Last_12-Months.csv, Meds_Lock_Cases_Last_12-Months.csv, Meds_Merge_Cases_Last_12-Months.csv, Meds_Robot_Cases_Last_12-Months.csv, Meds_SLA_Last_12-Months.csv, merged on case number. Derived dataset: Merged_Cases_With_SLA_Formatted.csv. Report generated: 2026-08-03 15:05:32.</w:t>
+        <w:t>Source: Source files: Meds_Cases_Last_12-Months.csv, Meds_Lock_Cases_Last_12-Months.csv, Meds_Merge_Cases_Last_12-Months.csv, Meds_Robot_Cases_Last_12-Months.csv, Meds_SLA_Last_12-Months.csv, merged on case number. Derived dataset: Merged_Cases_With_SLA_Formatted.csv. Report generated: 2026-08-03 15:14:02.</w:t>
       </w:r>
     </w:p>
     <w:tbl>
@@ -433,7 +433,7 @@
             </w:r>
             <w:r/>
             <w:r>
-              <w:t>This report covers 2912 Symphony cases. The data window is 01/07/2025 - 30/07/2026. Demand concentration: highest-volume theme is 'Other' (see Trend Distribution). Primary service metric: median time to resolution is 1 days, 3 hrs, 57 mins, with P90 of 28 days, 1 hrs, 1 mins. Current backlog: 260 unresolved cases; median open age 32 days, 6 hrs, 11 mins, P90 216 days, 18 hrs, 57 mins. Recommended priorities: (1) rapidly create KB articles and automation for high-volume, low-complexity issues; (2) strengthen triage to reduce P90 resolution; (3) remediate recurring environmental/import processes causing operational noise.</w:t>
+              <w:t>This report covers 2912 Symphony cases. The data window is 01/07/2025 - 30/07/2026. Demand concentration: highest-volume theme is 'Other' (see Trend Distribution). Primary service metric: median time to resolution is 1 days, 3 hrs, 57 mins, with P90 of 28 days, 1 hrs, 1 mins. Current backlog: 260 unresolved cases; median open age 32 days, 6 hrs, 20 mins, P90 216 days, 19 hrs, 5 mins. Recommended priorities: (1) rapidly create KB articles and automation for high-volume, low-complexity issues; (2) strengthen triage to reduce P90 resolution; (3) remediate recurring environmental/import processes causing operational noise.</w:t>
             </w:r>
           </w:p>
           <w:p>
@@ -678,7 +678,7 @@
           </w:tcPr>
           <w:p>
             <w:r>
-              <w:t>32 days, 6 hrs, 11 mins</w:t>
+              <w:t>32 days, 6 hrs, 20 mins</w:t>
             </w:r>
           </w:p>
         </w:tc>
@@ -710,7 +710,7 @@
           </w:tcPr>
           <w:p>
             <w:r>
-              <w:t>216 days, 18 hrs, 57 mins</w:t>
+              <w:t>216 days, 19 hrs, 5 mins</w:t>
             </w:r>
           </w:p>
         </w:tc>

</xml_diff>